<commit_message>
docs: complete Batch 1 navigation indexes
</commit_message>
<xml_diff>
--- a/docs/handbook-production/batch-1/output/APS_Operator_Handbook_Batch_1_Parts_I-IV.docx
+++ b/docs/handbook-production/batch-1/output/APS_Operator_Handbook_Batch_1_Parts_I-IV.docx
@@ -1657,8 +1657,19 @@
     </w:tbl>
     <w:p>
       <w:pPr>
-        <w:spacing w:after="40"/>
-      </w:pPr>
+        <w:spacing w:after="160"/>
+        <w:jc w:val="center"/>
+      </w:pPr>
+      <w:r>
+        <w:rPr>
+          <w:rFonts w:ascii="Montserrat" w:hAnsi="Montserrat"/>
+          <w:b w:val="0"/>
+          <w:i/>
+          <w:color w:val="6B6D78"/>
+          <w:sz w:val="17"/>
+        </w:rPr>
+        <w:t>Table 01</w:t>
+      </w:r>
     </w:p>
     <w:p>
       <w:pPr>
@@ -3004,8 +3015,19 @@
     </w:tbl>
     <w:p>
       <w:pPr>
-        <w:spacing w:after="40"/>
-      </w:pPr>
+        <w:spacing w:after="160"/>
+        <w:jc w:val="center"/>
+      </w:pPr>
+      <w:r>
+        <w:rPr>
+          <w:rFonts w:ascii="Montserrat" w:hAnsi="Montserrat"/>
+          <w:b w:val="0"/>
+          <w:i/>
+          <w:color w:val="6B6D78"/>
+          <w:sz w:val="17"/>
+        </w:rPr>
+        <w:t>Table 02</w:t>
+      </w:r>
     </w:p>
     <w:p>
       <w:pPr>
@@ -4219,8 +4241,19 @@
     </w:tbl>
     <w:p>
       <w:pPr>
-        <w:spacing w:after="40"/>
-      </w:pPr>
+        <w:spacing w:after="160"/>
+        <w:jc w:val="center"/>
+      </w:pPr>
+      <w:r>
+        <w:rPr>
+          <w:rFonts w:ascii="Montserrat" w:hAnsi="Montserrat"/>
+          <w:b w:val="0"/>
+          <w:i/>
+          <w:color w:val="6B6D78"/>
+          <w:sz w:val="17"/>
+        </w:rPr>
+        <w:t>Table 03</w:t>
+      </w:r>
     </w:p>
     <w:p>
       <w:pPr>
@@ -5578,8 +5611,19 @@
     </w:tbl>
     <w:p>
       <w:pPr>
-        <w:spacing w:after="40"/>
-      </w:pPr>
+        <w:spacing w:after="160"/>
+        <w:jc w:val="center"/>
+      </w:pPr>
+      <w:r>
+        <w:rPr>
+          <w:rFonts w:ascii="Montserrat" w:hAnsi="Montserrat"/>
+          <w:b w:val="0"/>
+          <w:i/>
+          <w:color w:val="6B6D78"/>
+          <w:sz w:val="17"/>
+        </w:rPr>
+        <w:t>Table 04</w:t>
+      </w:r>
     </w:p>
     <w:p>
       <w:pPr>
@@ -6931,8 +6975,19 @@
     </w:tbl>
     <w:p>
       <w:pPr>
-        <w:spacing w:after="40"/>
-      </w:pPr>
+        <w:spacing w:after="160"/>
+        <w:jc w:val="center"/>
+      </w:pPr>
+      <w:r>
+        <w:rPr>
+          <w:rFonts w:ascii="Montserrat" w:hAnsi="Montserrat"/>
+          <w:b w:val="0"/>
+          <w:i/>
+          <w:color w:val="6B6D78"/>
+          <w:sz w:val="17"/>
+        </w:rPr>
+        <w:t>Table 05</w:t>
+      </w:r>
     </w:p>
     <w:p>
       <w:pPr>
@@ -8118,8 +8173,19 @@
     </w:tbl>
     <w:p>
       <w:pPr>
-        <w:spacing w:after="40"/>
-      </w:pPr>
+        <w:spacing w:after="160"/>
+        <w:jc w:val="center"/>
+      </w:pPr>
+      <w:r>
+        <w:rPr>
+          <w:rFonts w:ascii="Montserrat" w:hAnsi="Montserrat"/>
+          <w:b w:val="0"/>
+          <w:i/>
+          <w:color w:val="6B6D78"/>
+          <w:sz w:val="17"/>
+        </w:rPr>
+        <w:t>Table 06</w:t>
+      </w:r>
     </w:p>
     <w:p>
       <w:pPr>
@@ -9529,8 +9595,19 @@
     </w:tbl>
     <w:p>
       <w:pPr>
-        <w:spacing w:after="40"/>
-      </w:pPr>
+        <w:spacing w:after="160"/>
+        <w:jc w:val="center"/>
+      </w:pPr>
+      <w:r>
+        <w:rPr>
+          <w:rFonts w:ascii="Montserrat" w:hAnsi="Montserrat"/>
+          <w:b w:val="0"/>
+          <w:i/>
+          <w:color w:val="6B6D78"/>
+          <w:sz w:val="17"/>
+        </w:rPr>
+        <w:t>Table 07</w:t>
+      </w:r>
     </w:p>
     <w:p>
       <w:pPr>
@@ -11239,8 +11316,19 @@
     </w:tbl>
     <w:p>
       <w:pPr>
-        <w:spacing w:after="40"/>
-      </w:pPr>
+        <w:spacing w:after="160"/>
+        <w:jc w:val="center"/>
+      </w:pPr>
+      <w:r>
+        <w:rPr>
+          <w:rFonts w:ascii="Montserrat" w:hAnsi="Montserrat"/>
+          <w:b w:val="0"/>
+          <w:i/>
+          <w:color w:val="6B6D78"/>
+          <w:sz w:val="17"/>
+        </w:rPr>
+        <w:t>Table 08</w:t>
+      </w:r>
     </w:p>
     <w:p>
       <w:pPr>
@@ -13509,8 +13597,19 @@
     </w:tbl>
     <w:p>
       <w:pPr>
-        <w:spacing w:after="40"/>
-      </w:pPr>
+        <w:spacing w:after="160"/>
+        <w:jc w:val="center"/>
+      </w:pPr>
+      <w:r>
+        <w:rPr>
+          <w:rFonts w:ascii="Montserrat" w:hAnsi="Montserrat"/>
+          <w:b w:val="0"/>
+          <w:i/>
+          <w:color w:val="6B6D78"/>
+          <w:sz w:val="17"/>
+        </w:rPr>
+        <w:t>Table 09</w:t>
+      </w:r>
     </w:p>
     <w:p>
       <w:pPr>
@@ -15322,8 +15421,19 @@
     </w:tbl>
     <w:p>
       <w:pPr>
-        <w:spacing w:after="40"/>
-      </w:pPr>
+        <w:spacing w:after="160"/>
+        <w:jc w:val="center"/>
+      </w:pPr>
+      <w:r>
+        <w:rPr>
+          <w:rFonts w:ascii="Montserrat" w:hAnsi="Montserrat"/>
+          <w:b w:val="0"/>
+          <w:i/>
+          <w:color w:val="6B6D78"/>
+          <w:sz w:val="17"/>
+        </w:rPr>
+        <w:t>Table 10</w:t>
+      </w:r>
     </w:p>
     <w:p>
       <w:pPr>
@@ -16529,8 +16639,19 @@
     </w:tbl>
     <w:p>
       <w:pPr>
-        <w:spacing w:after="40"/>
-      </w:pPr>
+        <w:spacing w:after="160"/>
+        <w:jc w:val="center"/>
+      </w:pPr>
+      <w:r>
+        <w:rPr>
+          <w:rFonts w:ascii="Montserrat" w:hAnsi="Montserrat"/>
+          <w:b w:val="0"/>
+          <w:i/>
+          <w:color w:val="6B6D78"/>
+          <w:sz w:val="17"/>
+        </w:rPr>
+        <w:t>Table 11</w:t>
+      </w:r>
     </w:p>
     <w:p>
       <w:pPr>
@@ -17739,8 +17860,19 @@
     </w:tbl>
     <w:p>
       <w:pPr>
-        <w:spacing w:after="40"/>
-      </w:pPr>
+        <w:spacing w:after="160"/>
+        <w:jc w:val="center"/>
+      </w:pPr>
+      <w:r>
+        <w:rPr>
+          <w:rFonts w:ascii="Montserrat" w:hAnsi="Montserrat"/>
+          <w:b w:val="0"/>
+          <w:i/>
+          <w:color w:val="6B6D78"/>
+          <w:sz w:val="17"/>
+        </w:rPr>
+        <w:t>Table 12</w:t>
+      </w:r>
     </w:p>
     <w:p>
       <w:pPr>
@@ -18768,6 +18900,202 @@
           <w:sz w:val="21"/>
         </w:rPr>
         <w:t>Internal/working means Admin-only unless a maintained release workflow authorizes external visibility. Existence on a request never creates portal visibility. Customer-released means the exact eligible file crossed the controlled release boundary and was verified.</w:t>
+      </w:r>
+    </w:p>
+    <w:p>
+      <w:pPr>
+        <w:pStyle w:val="Heading1"/>
+        <w:pageBreakBefore w:val="0"/>
+      </w:pPr>
+      <w:r>
+        <w:t>QR-13 — APS System Map</w:t>
+      </w:r>
+    </w:p>
+    <w:p>
+      <w:pPr>
+        <w:spacing w:after="120" w:line="293" w:lineRule="auto"/>
+      </w:pPr>
+      <w:r>
+        <w:rPr>
+          <w:rFonts w:ascii="Montserrat" w:hAnsi="Montserrat"/>
+          <w:b w:val="0"/>
+          <w:i w:val="0"/>
+          <w:color w:val="2D2D2D"/>
+          <w:sz w:val="21"/>
+        </w:rPr>
+        <w:t xml:space="preserve">Customer or Business → APS request and evidence → applicable provider/service path → verified customer outcome. At every handoff, confirm identity, authorization, document, money, recipient, and the next applicable gate. </w:t>
+      </w:r>
+      <w:r>
+        <w:rPr>
+          <w:rFonts w:ascii="Montserrat" w:hAnsi="Montserrat"/>
+          <w:b/>
+          <w:i w:val="0"/>
+          <w:color w:val="2D2D2D"/>
+          <w:sz w:val="21"/>
+        </w:rPr>
+        <w:t>STOP IF:</w:t>
+      </w:r>
+      <w:r>
+        <w:rPr>
+          <w:rFonts w:ascii="Montserrat" w:hAnsi="Montserrat"/>
+          <w:b w:val="0"/>
+          <w:i w:val="0"/>
+          <w:color w:val="2D2D2D"/>
+          <w:sz w:val="21"/>
+        </w:rPr>
+        <w:t xml:space="preserve"> those facts conflict or cannot be verified.</w:t>
+      </w:r>
+    </w:p>
+    <w:p>
+      <w:pPr>
+        <w:pStyle w:val="Heading1"/>
+        <w:pageBreakBefore w:val="0"/>
+      </w:pPr>
+      <w:r>
+        <w:t>QR-14 — Universal Request Lifecycle</w:t>
+      </w:r>
+    </w:p>
+    <w:p>
+      <w:pPr>
+        <w:spacing w:after="120" w:line="293" w:lineRule="auto"/>
+      </w:pPr>
+      <w:r>
+        <w:rPr>
+          <w:rFonts w:ascii="Montserrat" w:hAnsi="Montserrat"/>
+          <w:b w:val="0"/>
+          <w:i w:val="0"/>
+          <w:color w:val="2D2D2D"/>
+          <w:sz w:val="21"/>
+        </w:rPr>
+        <w:t>Requested → reviewed/quoted → approved/paid as applicable → scheduled/fulfilled → completed. Keep each state distinct: a request may be accepted without approval, paid without fulfillment, or fulfilled without all completion and release gates being satisfied.</w:t>
+      </w:r>
+    </w:p>
+    <w:p>
+      <w:pPr>
+        <w:pStyle w:val="Heading1"/>
+        <w:pageBreakBefore w:val="0"/>
+      </w:pPr>
+      <w:r>
+        <w:t>QR-15 — Review Queue Decision Guide</w:t>
+      </w:r>
+    </w:p>
+    <w:p>
+      <w:pPr>
+        <w:spacing w:after="120" w:line="293" w:lineRule="auto"/>
+      </w:pPr>
+      <w:r>
+        <w:rPr>
+          <w:rFonts w:ascii="Montserrat" w:hAnsi="Montserrat"/>
+          <w:b w:val="0"/>
+          <w:i w:val="0"/>
+          <w:color w:val="2D2D2D"/>
+          <w:sz w:val="21"/>
+        </w:rPr>
+        <w:t xml:space="preserve">Open the exact request and identify the blocker, reason, waiting age, and supporting evidence. </w:t>
+      </w:r>
+      <w:r>
+        <w:rPr>
+          <w:rFonts w:ascii="Montserrat" w:hAnsi="Montserrat"/>
+          <w:b/>
+          <w:i w:val="0"/>
+          <w:color w:val="2D2D2D"/>
+          <w:sz w:val="21"/>
+        </w:rPr>
+        <w:t>YES — evidence now satisfies the gate:</w:t>
+      </w:r>
+      <w:r>
+        <w:rPr>
+          <w:rFonts w:ascii="Montserrat" w:hAnsi="Montserrat"/>
+          <w:b w:val="0"/>
+          <w:i w:val="0"/>
+          <w:color w:val="2D2D2D"/>
+          <w:sz w:val="21"/>
+        </w:rPr>
+        <w:t xml:space="preserve"> perform the maintained next action and verify the result. </w:t>
+      </w:r>
+      <w:r>
+        <w:rPr>
+          <w:rFonts w:ascii="Montserrat" w:hAnsi="Montserrat"/>
+          <w:b/>
+          <w:i w:val="0"/>
+          <w:color w:val="2D2D2D"/>
+          <w:sz w:val="21"/>
+        </w:rPr>
+        <w:t>NO — evidence is missing:</w:t>
+      </w:r>
+      <w:r>
+        <w:rPr>
+          <w:rFonts w:ascii="Montserrat" w:hAnsi="Montserrat"/>
+          <w:b w:val="0"/>
+          <w:i w:val="0"/>
+          <w:color w:val="2D2D2D"/>
+          <w:sz w:val="21"/>
+        </w:rPr>
+        <w:t xml:space="preserve"> keep the item on hold and request the exact fact through the maintained path. </w:t>
+      </w:r>
+      <w:r>
+        <w:rPr>
+          <w:rFonts w:ascii="Montserrat" w:hAnsi="Montserrat"/>
+          <w:b/>
+          <w:i w:val="0"/>
+          <w:color w:val="2D2D2D"/>
+          <w:sz w:val="21"/>
+        </w:rPr>
+        <w:t>CONFLICT:</w:t>
+      </w:r>
+      <w:r>
+        <w:rPr>
+          <w:rFonts w:ascii="Montserrat" w:hAnsi="Montserrat"/>
+          <w:b w:val="0"/>
+          <w:i w:val="0"/>
+          <w:color w:val="2D2D2D"/>
+          <w:sz w:val="21"/>
+        </w:rPr>
+        <w:t xml:space="preserve"> preserve both sources and escalate. Never clear a queue item merely to reduce the count.</w:t>
+      </w:r>
+    </w:p>
+    <w:p>
+      <w:pPr>
+        <w:pStyle w:val="Heading1"/>
+        <w:pageBreakBefore w:val="0"/>
+      </w:pPr>
+      <w:r>
+        <w:t>QR-16 — Document Classification</w:t>
+      </w:r>
+    </w:p>
+    <w:p>
+      <w:pPr>
+        <w:spacing w:after="120" w:line="293" w:lineRule="auto"/>
+      </w:pPr>
+      <w:r>
+        <w:rPr>
+          <w:rFonts w:ascii="Montserrat" w:hAnsi="Montserrat"/>
+          <w:b w:val="0"/>
+          <w:i w:val="0"/>
+          <w:color w:val="2D2D2D"/>
+          <w:sz w:val="21"/>
+        </w:rPr>
+        <w:t xml:space="preserve">Classify by purpose and visibility: customer upload; internal APS document; working document; completed/notarized; completed/customer-eligible; customer-released; Proof completed; loan package; borrower copy; scanback; return proof; invoice; or receipt. Classification does not itself release a file. </w:t>
+      </w:r>
+      <w:r>
+        <w:rPr>
+          <w:rFonts w:ascii="Montserrat" w:hAnsi="Montserrat"/>
+          <w:b/>
+          <w:i w:val="0"/>
+          <w:color w:val="2D2D2D"/>
+          <w:sz w:val="21"/>
+        </w:rPr>
+        <w:t>STOP IF:</w:t>
+      </w:r>
+      <w:r>
+        <w:rPr>
+          <w:rFonts w:ascii="Montserrat" w:hAnsi="Montserrat"/>
+          <w:b w:val="0"/>
+          <w:i w:val="0"/>
+          <w:color w:val="2D2D2D"/>
+          <w:sz w:val="21"/>
+        </w:rPr>
+        <w:t xml:space="preserve"> purpose, version, request, recipient, or eligibility is uncertain.</w:t>
       </w:r>
     </w:p>
     <w:p>
@@ -19743,8 +20071,19 @@
     </w:tbl>
     <w:p>
       <w:pPr>
-        <w:spacing w:after="40"/>
-      </w:pPr>
+        <w:spacing w:after="160"/>
+        <w:jc w:val="center"/>
+      </w:pPr>
+      <w:r>
+        <w:rPr>
+          <w:rFonts w:ascii="Montserrat" w:hAnsi="Montserrat"/>
+          <w:b w:val="0"/>
+          <w:i/>
+          <w:color w:val="6B6D78"/>
+          <w:sz w:val="17"/>
+        </w:rPr>
+        <w:t>Table 13</w:t>
+      </w:r>
     </w:p>
     <w:p>
       <w:pPr>

</xml_diff>